<commit_message>
docs: add submission identity details
</commit_message>
<xml_diff>
--- a/reports/ThermalGuard_Submission_Report.docx
+++ b/reports/ThermalGuard_Submission_Report.docx
@@ -42,16 +42,122 @@
     </w:p>
     <w:p>
       <w:pPr>
-        <w:spacing w:before="2100"/>
+        <w:spacing w:before="560"/>
         <w:jc w:val="center"/>
       </w:pPr>
       <w:r>
         <w:rPr>
           <w:rFonts w:ascii="Aptos" w:hAnsi="Aptos"/>
           <w:i/>
-          <w:sz w:val="22"/>
+          <w:sz w:val="20"/>
         </w:rPr>
         <w:t>Supervised regression with profile-aware evaluation and explainable inference</w:t>
+      </w:r>
+    </w:p>
+    <w:p>
+      <w:pPr>
+        <w:spacing w:after="60" w:before="160"/>
+        <w:jc w:val="center"/>
+      </w:pPr>
+      <w:r>
+        <w:rPr>
+          <w:rFonts w:ascii="Aptos" w:hAnsi="Aptos"/>
+          <w:b/>
+          <w:sz w:val="20"/>
+        </w:rPr>
+        <w:t>Submitted by</w:t>
+      </w:r>
+    </w:p>
+    <w:p>
+      <w:pPr>
+        <w:spacing w:after="60"/>
+        <w:jc w:val="center"/>
+      </w:pPr>
+      <w:r>
+        <w:rPr>
+          <w:rFonts w:ascii="Aptos" w:hAnsi="Aptos"/>
+          <w:sz w:val="20"/>
+        </w:rPr>
+        <w:t>Kanha Gupta  1025220005</w:t>
+      </w:r>
+    </w:p>
+    <w:p>
+      <w:pPr>
+        <w:spacing w:after="60"/>
+        <w:jc w:val="center"/>
+      </w:pPr>
+      <w:r>
+        <w:rPr>
+          <w:rFonts w:ascii="Aptos" w:hAnsi="Aptos"/>
+          <w:sz w:val="20"/>
+        </w:rPr>
+        <w:t>Nilesh Kumar  1025220011</w:t>
+      </w:r>
+    </w:p>
+    <w:p>
+      <w:pPr>
+        <w:spacing w:after="60"/>
+        <w:jc w:val="center"/>
+      </w:pPr>
+      <w:r>
+        <w:rPr>
+          <w:rFonts w:ascii="Aptos" w:hAnsi="Aptos"/>
+          <w:sz w:val="20"/>
+        </w:rPr>
+        <w:t>Aaditya Agarwal  1025220010</w:t>
+      </w:r>
+    </w:p>
+    <w:p>
+      <w:pPr>
+        <w:spacing w:after="60"/>
+        <w:jc w:val="center"/>
+      </w:pPr>
+      <w:r>
+        <w:rPr>
+          <w:rFonts w:ascii="Aptos" w:hAnsi="Aptos"/>
+          <w:sz w:val="20"/>
+        </w:rPr>
+        <w:t>Batch 2V11</w:t>
+      </w:r>
+    </w:p>
+    <w:p>
+      <w:pPr>
+        <w:spacing w:after="60" w:before="160"/>
+        <w:jc w:val="center"/>
+      </w:pPr>
+      <w:r>
+        <w:rPr>
+          <w:rFonts w:ascii="Aptos" w:hAnsi="Aptos"/>
+          <w:b/>
+          <w:sz w:val="20"/>
+        </w:rPr>
+        <w:t>Submitted to</w:t>
+      </w:r>
+    </w:p>
+    <w:p>
+      <w:pPr>
+        <w:spacing w:after="60"/>
+        <w:jc w:val="center"/>
+      </w:pPr>
+      <w:r>
+        <w:rPr>
+          <w:rFonts w:ascii="Aptos" w:hAnsi="Aptos"/>
+          <w:sz w:val="20"/>
+        </w:rPr>
+        <w:t>Dr. Arun Singh Pundir</w:t>
+      </w:r>
+    </w:p>
+    <w:p>
+      <w:pPr>
+        <w:spacing w:after="60"/>
+        <w:jc w:val="center"/>
+      </w:pPr>
+      <w:r>
+        <w:rPr>
+          <w:rFonts w:ascii="Aptos" w:hAnsi="Aptos"/>
+          <w:sz w:val="20"/>
+        </w:rPr>
+        <w:t>Thapar Institute of Engineering and Technology</w:t>
       </w:r>
     </w:p>
     <w:p>

</xml_diff>

<commit_message>
docs: add TIET logo to report cover
</commit_message>
<xml_diff>
--- a/reports/ThermalGuard_Submission_Report.docx
+++ b/reports/ThermalGuard_Submission_Report.docx
@@ -4,8 +4,48 @@
   <w:body>
     <w:p>
       <w:pPr>
+        <w:spacing w:after="200"/>
+        <w:jc w:val="center"/>
+      </w:pPr>
+      <w:r>
+        <w:drawing>
+          <wp:inline xmlns:a="http://schemas.openxmlformats.org/drawingml/2006/main" xmlns:pic="http://schemas.openxmlformats.org/drawingml/2006/picture">
+            <wp:extent cx="3291840" cy="1267492"/>
+            <wp:docPr id="1" name="Picture 1" descr="Thapar Institute of Engineering and Technology logo"/>
+            <wp:cNvGraphicFramePr>
+              <a:graphicFrameLocks noChangeAspect="1"/>
+            </wp:cNvGraphicFramePr>
+            <a:graphic>
+              <a:graphicData uri="http://schemas.openxmlformats.org/drawingml/2006/picture">
+                <pic:pic>
+                  <pic:nvPicPr>
+                    <pic:cNvPr id="0" name="TIET LOGO.png"/>
+                    <pic:cNvPicPr/>
+                  </pic:nvPicPr>
+                  <pic:blipFill>
+                    <a:blip r:embed="rId10"/>
+                    <a:stretch>
+                      <a:fillRect/>
+                    </a:stretch>
+                  </pic:blipFill>
+                  <pic:spPr>
+                    <a:xfrm>
+                      <a:off x="0" y="0"/>
+                      <a:ext cx="3291840" cy="1267492"/>
+                    </a:xfrm>
+                    <a:prstGeom prst="rect"/>
+                  </pic:spPr>
+                </pic:pic>
+              </a:graphicData>
+            </a:graphic>
+          </wp:inline>
+        </w:drawing>
+      </w:r>
+    </w:p>
+    <w:p>
+      <w:pPr>
         <w:pStyle w:val="Title"/>
-        <w:spacing w:before="2200"/>
+        <w:spacing w:before="160"/>
         <w:jc w:val="center"/>
       </w:pPr>
       <w:r>
@@ -1000,7 +1040,7 @@
         <w:drawing>
           <wp:inline xmlns:a="http://schemas.openxmlformats.org/drawingml/2006/main" xmlns:pic="http://schemas.openxmlformats.org/drawingml/2006/picture">
             <wp:extent cx="6035040" cy="2263140"/>
-            <wp:docPr id="1" name="Picture 1" descr="Figure 1 Dataset overview showing the rotor temperature distribution and measurements per profile"/>
+            <wp:docPr id="2" name="Picture 2" descr="Figure 1 Dataset overview showing the rotor temperature distribution and measurements per profile"/>
             <wp:cNvGraphicFramePr>
               <a:graphicFrameLocks noChangeAspect="1"/>
             </wp:cNvGraphicFramePr>
@@ -1012,7 +1052,7 @@
                     <pic:cNvPicPr/>
                   </pic:nvPicPr>
                   <pic:blipFill>
-                    <a:blip r:embed="rId10"/>
+                    <a:blip r:embed="rId11"/>
                     <a:stretch>
                       <a:fillRect/>
                     </a:stretch>
@@ -1329,7 +1369,7 @@
         <w:drawing>
           <wp:inline xmlns:a="http://schemas.openxmlformats.org/drawingml/2006/main" xmlns:pic="http://schemas.openxmlformats.org/drawingml/2006/picture">
             <wp:extent cx="6035040" cy="4693920"/>
-            <wp:docPr id="2" name="Picture 2" descr="Figure 2 Spearman correlations for a reproducible 100000 row sample"/>
+            <wp:docPr id="3" name="Picture 3" descr="Figure 2 Spearman correlations for a reproducible 100000 row sample"/>
             <wp:cNvGraphicFramePr>
               <a:graphicFrameLocks noChangeAspect="1"/>
             </wp:cNvGraphicFramePr>
@@ -1341,7 +1381,7 @@
                     <pic:cNvPicPr/>
                   </pic:nvPicPr>
                   <pic:blipFill>
-                    <a:blip r:embed="rId11"/>
+                    <a:blip r:embed="rId12"/>
                     <a:stretch>
                       <a:fillRect/>
                     </a:stretch>
@@ -1520,7 +1560,7 @@
         <w:drawing>
           <wp:inline xmlns:a="http://schemas.openxmlformats.org/drawingml/2006/main" xmlns:pic="http://schemas.openxmlformats.org/drawingml/2006/picture">
             <wp:extent cx="6217920" cy="2487168"/>
-            <wp:docPr id="3" name="Picture 3" descr="Figure 3 ThermalGuard training evaluation and inference workflow"/>
+            <wp:docPr id="4" name="Picture 4" descr="Figure 3 ThermalGuard training evaluation and inference workflow"/>
             <wp:cNvGraphicFramePr>
               <a:graphicFrameLocks noChangeAspect="1"/>
             </wp:cNvGraphicFramePr>
@@ -1532,7 +1572,7 @@
                     <pic:cNvPicPr/>
                   </pic:nvPicPr>
                   <pic:blipFill>
-                    <a:blip r:embed="rId12"/>
+                    <a:blip r:embed="rId13"/>
                     <a:stretch>
                       <a:fillRect/>
                     </a:stretch>
@@ -3616,7 +3656,7 @@
         <w:drawing>
           <wp:inline xmlns:a="http://schemas.openxmlformats.org/drawingml/2006/main" xmlns:pic="http://schemas.openxmlformats.org/drawingml/2006/picture">
             <wp:extent cx="6035040" cy="2514600"/>
-            <wp:docPr id="4" name="Picture 4" descr="Figure 4 Actual predicted and residual diagnostics for the final model"/>
+            <wp:docPr id="5" name="Picture 5" descr="Figure 4 Actual predicted and residual diagnostics for the final model"/>
             <wp:cNvGraphicFramePr>
               <a:graphicFrameLocks noChangeAspect="1"/>
             </wp:cNvGraphicFramePr>
@@ -3628,7 +3668,7 @@
                     <pic:cNvPicPr/>
                   </pic:nvPicPr>
                   <pic:blipFill>
-                    <a:blip r:embed="rId13"/>
+                    <a:blip r:embed="rId14"/>
                     <a:stretch>
                       <a:fillRect/>
                     </a:stretch>

</xml_diff>